<commit_message>
added script to process data from 2020-12 and onwards
</commit_message>
<xml_diff>
--- a/notes-rent-vs-buy.docx
+++ b/notes-rent-vs-buy.docx
@@ -1130,15 +1130,7 @@
         <w:t xml:space="preserve">home rental data is sparse </w:t>
       </w:r>
       <w:r>
-        <w:t xml:space="preserve">in </w:t>
-      </w:r>
-      <w:proofErr w:type="gramStart"/>
-      <w:r>
-        <w:t>Canada</w:t>
-      </w:r>
-      <w:proofErr w:type="gramEnd"/>
-      <w:r>
-        <w:t xml:space="preserve"> </w:t>
+        <w:t xml:space="preserve">in Canada </w:t>
       </w:r>
       <w:r>
         <w:t xml:space="preserve">so </w:t>
@@ -1212,15 +1204,7 @@
         </w:numPr>
       </w:pPr>
       <w:r>
-        <w:t>Domain/</w:t>
-      </w:r>
-      <w:proofErr w:type="spellStart"/>
-      <w:r>
-        <w:t>Cotality</w:t>
-      </w:r>
-      <w:proofErr w:type="spellEnd"/>
-      <w:r>
-        <w:t xml:space="preserve"> indices</w:t>
+        <w:t>Domain/Cotality indices</w:t>
       </w:r>
     </w:p>
     <w:p>
@@ -1255,15 +1239,7 @@
         <w:t xml:space="preserve"> </w:t>
       </w:r>
       <w:r>
-        <w:t xml:space="preserve">has </w:t>
-      </w:r>
-      <w:proofErr w:type="gramStart"/>
-      <w:r>
-        <w:t>Aus</w:t>
-      </w:r>
-      <w:proofErr w:type="gramEnd"/>
-      <w:r>
-        <w:t xml:space="preserve"> housing and rent components from Sep 1972 but it’s not </w:t>
+        <w:t xml:space="preserve">has Aus housing and rent components from Sep 1972 but it’s not </w:t>
       </w:r>
       <w:r>
         <w:t>disaggregated</w:t>
@@ -1358,15 +1334,7 @@
         </w:numPr>
       </w:pPr>
       <w:r>
-        <w:t xml:space="preserve">ugh </w:t>
-      </w:r>
-      <w:proofErr w:type="spellStart"/>
-      <w:r>
-        <w:t>gotta</w:t>
-      </w:r>
-      <w:proofErr w:type="spellEnd"/>
-      <w:r>
-        <w:t xml:space="preserve"> go through </w:t>
+        <w:t xml:space="preserve">ugh gotta go through </w:t>
       </w:r>
       <w:r>
         <w:t>the data</w:t>
@@ -1521,6 +1489,33 @@
       <w:pPr>
         <w:pStyle w:val="ListParagraph"/>
         <w:numPr>
+          <w:ilvl w:val="2"/>
+          <w:numId w:val="1"/>
+        </w:numPr>
+      </w:pPr>
+      <w:r>
+        <w:t>We can get the median Brisbane metro rents by</w:t>
+      </w:r>
+      <w:r>
+        <w:t xml:space="preserve"> taking the</w:t>
+      </w:r>
+      <w:r>
+        <w:t xml:space="preserve"> weighted average of the metro </w:t>
+      </w:r>
+      <w:r>
+        <w:t>LGA’s medians for th</w:t>
+      </w:r>
+      <w:r>
+        <w:t>e dwelling</w:t>
+      </w:r>
+      <w:r>
+        <w:t xml:space="preserve"> type.</w:t>
+      </w:r>
+    </w:p>
+    <w:p>
+      <w:pPr>
+        <w:pStyle w:val="ListParagraph"/>
+        <w:numPr>
           <w:ilvl w:val="1"/>
           <w:numId w:val="1"/>
         </w:numPr>
@@ -1598,49 +1593,39 @@
       <w:r>
         <w:t xml:space="preserve"> </w:t>
       </w:r>
-      <w:r>
-        <w:fldChar w:fldCharType="begin"/>
-      </w:r>
-      <w:r>
-        <w:instrText>HYPERLINK "https://discover.data.vic.gov.au/dataset/rental-report-quarterly-quarterly-median-rents-by-lga"</w:instrText>
-      </w:r>
-      <w:r>
-        <w:fldChar w:fldCharType="separate"/>
-      </w:r>
-      <w:r>
-        <w:rPr>
-          <w:rStyle w:val="Hyperlink"/>
-        </w:rPr>
-        <w:t>quarterly</w:t>
-      </w:r>
-      <w:r>
-        <w:rPr>
-          <w:rStyle w:val="Hyperlink"/>
-        </w:rPr>
+      <w:hyperlink r:id="rId20" w:history="1">
+        <w:r>
+          <w:rPr>
+            <w:rStyle w:val="Hyperlink"/>
+          </w:rPr>
+          <w:t>quarterly</w:t>
+        </w:r>
+        <w:r>
+          <w:rPr>
+            <w:rStyle w:val="Hyperlink"/>
+          </w:rPr>
+          <w:t xml:space="preserve"> </w:t>
+        </w:r>
+        <w:r>
+          <w:rPr>
+            <w:rStyle w:val="Hyperlink"/>
+          </w:rPr>
+          <w:t>median rents</w:t>
+        </w:r>
+      </w:hyperlink>
+      <w:r>
+        <w:t xml:space="preserve"> by dwelling type and LGA (including metro aggregation)</w:t>
+      </w:r>
+      <w:r>
+        <w:t xml:space="preserve"> from Mar 2000</w:t>
+      </w:r>
+      <w:r>
+        <w:t xml:space="preserve"> as well as a</w:t>
+      </w:r>
+      <w:r>
         <w:t xml:space="preserve"> </w:t>
       </w:r>
-      <w:r>
-        <w:rPr>
-          <w:rStyle w:val="Hyperlink"/>
-        </w:rPr>
-        <w:t>median rents</w:t>
-      </w:r>
-      <w:r>
-        <w:fldChar w:fldCharType="end"/>
-      </w:r>
-      <w:r>
-        <w:t xml:space="preserve"> by dwelling type and LGA (including metro aggregation)</w:t>
-      </w:r>
-      <w:r>
-        <w:t xml:space="preserve"> from Mar 2000</w:t>
-      </w:r>
-      <w:r>
-        <w:t xml:space="preserve"> as well as a</w:t>
-      </w:r>
-      <w:r>
-        <w:t xml:space="preserve"> </w:t>
-      </w:r>
-      <w:hyperlink r:id="rId20" w:history="1">
+      <w:hyperlink r:id="rId21" w:history="1">
         <w:r>
           <w:rPr>
             <w:rStyle w:val="Hyperlink"/>
@@ -1657,7 +1642,7 @@
           <w:numId w:val="1"/>
         </w:numPr>
       </w:pPr>
-      <w:hyperlink r:id="rId21" w:history="1">
+      <w:hyperlink r:id="rId22" w:history="1">
         <w:r>
           <w:rPr>
             <w:rStyle w:val="Hyperlink"/>
@@ -1695,19 +1680,46 @@
           <w:numId w:val="1"/>
         </w:numPr>
       </w:pPr>
-      <w:proofErr w:type="gramStart"/>
-      <w:r>
-        <w:t>Sadly</w:t>
-      </w:r>
-      <w:proofErr w:type="gramEnd"/>
-      <w:r>
-        <w:t xml:space="preserve"> we don’t have any data for WA – the closest we have is bond lodgement data that gives the suburb and weekly rent… but not type of </w:t>
+      <w:r>
+        <w:t xml:space="preserve">Sadly we don’t have any data for WA – the closest we have is bond lodgement data that gives the suburb and weekly rent… but not type of </w:t>
       </w:r>
       <w:r>
         <w:t>dwelling</w:t>
       </w:r>
       <w:r>
         <w:t>!</w:t>
+      </w:r>
+    </w:p>
+    <w:p>
+      <w:pPr>
+        <w:pStyle w:val="ListParagraph"/>
+        <w:numPr>
+          <w:ilvl w:val="2"/>
+          <w:numId w:val="1"/>
+        </w:numPr>
+      </w:pPr>
+      <w:r>
+        <w:t xml:space="preserve">Can get median for all dwellings from </w:t>
+      </w:r>
+      <w:hyperlink r:id="rId23" w:history="1">
+        <w:r>
+          <w:rPr>
+            <w:rStyle w:val="Hyperlink"/>
+          </w:rPr>
+          <w:t xml:space="preserve">Rental Affordability </w:t>
+        </w:r>
+        <w:r>
+          <w:rPr>
+            <w:rStyle w:val="Hyperlink"/>
+          </w:rPr>
+          <w:t>Index</w:t>
+        </w:r>
+      </w:hyperlink>
+      <w:r>
+        <w:t xml:space="preserve"> – can then cross-check with Census data (ABS TableBuilder?) to </w:t>
+      </w:r>
+      <w:r>
+        <w:t>estimate median rents for 2-bed flats and 3-bed houses as a % of the median for all dwellings</w:t>
       </w:r>
     </w:p>
     <w:p>
@@ -1718,7 +1730,7 @@
           <w:numId w:val="1"/>
         </w:numPr>
       </w:pPr>
-      <w:hyperlink r:id="rId22" w:history="1">
+      <w:hyperlink r:id="rId24" w:history="1">
         <w:r>
           <w:rPr>
             <w:rStyle w:val="Hyperlink"/>
@@ -1742,9 +1754,15 @@
       </w:pPr>
       <w:bookmarkStart w:id="2" w:name="_Toc230984662"/>
       <w:r>
+        <w:t xml:space="preserve">Other renter costs - </w:t>
+      </w:r>
+      <w:r>
         <w:t>Tenant insurance</w:t>
       </w:r>
       <w:bookmarkEnd w:id="2"/>
+      <w:r>
+        <w:t xml:space="preserve"> and moving</w:t>
+      </w:r>
     </w:p>
     <w:p>
       <w:pPr>
@@ -1763,16 +1781,6 @@
     </w:p>
     <w:p>
       <w:pPr>
-        <w:pStyle w:val="Heading2"/>
-      </w:pPr>
-      <w:bookmarkStart w:id="3" w:name="_Toc230984663"/>
-      <w:r>
-        <w:t>Investments</w:t>
-      </w:r>
-      <w:bookmarkEnd w:id="3"/>
-    </w:p>
-    <w:p>
-      <w:pPr>
         <w:pStyle w:val="ListParagraph"/>
         <w:numPr>
           <w:ilvl w:val="0"/>
@@ -1780,12 +1788,47 @@
         </w:numPr>
       </w:pPr>
       <w:r>
+        <w:t>Assuming moving every two years at $</w:t>
+      </w:r>
+      <w:r>
+        <w:t>1200 gets around $</w:t>
+      </w:r>
+      <w:r>
+        <w:t>600/year</w:t>
+      </w:r>
+      <w:r>
+        <w:t xml:space="preserve"> in moving costs</w:t>
+      </w:r>
+      <w:r>
+        <w:t xml:space="preserve"> in modern money. We should deflate this per CPI.</w:t>
+      </w:r>
+    </w:p>
+    <w:p>
+      <w:pPr>
+        <w:pStyle w:val="Heading2"/>
+      </w:pPr>
+      <w:bookmarkStart w:id="3" w:name="_Toc230984663"/>
+      <w:r>
+        <w:lastRenderedPageBreak/>
+        <w:t>Investments</w:t>
+      </w:r>
+      <w:bookmarkEnd w:id="3"/>
+    </w:p>
+    <w:p>
+      <w:pPr>
+        <w:pStyle w:val="ListParagraph"/>
+        <w:numPr>
+          <w:ilvl w:val="0"/>
+          <w:numId w:val="1"/>
+        </w:numPr>
+      </w:pPr>
+      <w:r>
         <w:t>Aus &amp; international indices net of dividends</w:t>
       </w:r>
       <w:r>
         <w:t xml:space="preserve"> (</w:t>
       </w:r>
-      <w:hyperlink r:id="rId23" w:history="1">
+      <w:hyperlink r:id="rId25" w:history="1">
         <w:r>
           <w:rPr>
             <w:rStyle w:val="Hyperlink"/>
@@ -1811,7 +1854,7 @@
       <w:r>
         <w:t xml:space="preserve"> or </w:t>
       </w:r>
-      <w:hyperlink r:id="rId24" w:history="1">
+      <w:hyperlink r:id="rId26" w:history="1">
         <w:r>
           <w:rPr>
             <w:rStyle w:val="Hyperlink"/>
@@ -1825,7 +1868,7 @@
       <w:r>
         <w:t xml:space="preserve"> and </w:t>
       </w:r>
-      <w:hyperlink r:id="rId25" w:history="1">
+      <w:hyperlink r:id="rId27" w:history="1">
         <w:r>
           <w:rPr>
             <w:rStyle w:val="Hyperlink"/>
@@ -1890,7 +1933,7 @@
           <w:numId w:val="1"/>
         </w:numPr>
       </w:pPr>
-      <w:hyperlink r:id="rId26" w:history="1">
+      <w:hyperlink r:id="rId28" w:history="1">
         <w:r>
           <w:rPr>
             <w:rStyle w:val="Hyperlink"/>
@@ -1911,11 +1954,7 @@
         <w:t>, but we might not be able to assume people can easily invest in international shares</w:t>
       </w:r>
       <w:r>
-        <w:t xml:space="preserve"> over the earlier part of the </w:t>
-      </w:r>
-      <w:r>
-        <w:lastRenderedPageBreak/>
-        <w:t>horizon</w:t>
+        <w:t xml:space="preserve"> over the earlier part of the horizon</w:t>
       </w:r>
       <w:r>
         <w:t>.</w:t>
@@ -1935,7 +1974,7 @@
       <w:r>
         <w:t>in Oct/Nov 2007 (</w:t>
       </w:r>
-      <w:hyperlink r:id="rId27" w:history="1">
+      <w:hyperlink r:id="rId29" w:history="1">
         <w:r>
           <w:rPr>
             <w:rStyle w:val="Hyperlink"/>
@@ -1995,7 +2034,7 @@
                     <pic:cNvPicPr/>
                   </pic:nvPicPr>
                   <pic:blipFill>
-                    <a:blip r:embed="rId28"/>
+                    <a:blip r:embed="rId30"/>
                     <a:stretch>
                       <a:fillRect/>
                     </a:stretch>
@@ -2054,6 +2093,7 @@
       </w:pPr>
       <w:bookmarkStart w:id="4" w:name="_Toc230984664"/>
       <w:r>
+        <w:lastRenderedPageBreak/>
         <w:t>Home prices</w:t>
       </w:r>
       <w:bookmarkEnd w:id="4"/>
@@ -2080,7 +2120,7 @@
           <w:numId w:val="1"/>
         </w:numPr>
       </w:pPr>
-      <w:hyperlink r:id="rId29" w:history="1">
+      <w:hyperlink r:id="rId31" w:history="1">
         <w:r>
           <w:rPr>
             <w:rStyle w:val="Hyperlink"/>
@@ -2128,7 +2168,6 @@
         </w:numPr>
       </w:pPr>
       <w:r>
-        <w:lastRenderedPageBreak/>
         <w:t xml:space="preserve">Limitations: no hedonic adjustments (home prices increased partly because they got bigger and better) </w:t>
       </w:r>
     </w:p>
@@ -2143,7 +2182,7 @@
       <w:r>
         <w:t>State data (</w:t>
       </w:r>
-      <w:hyperlink r:id="rId30" w:history="1">
+      <w:hyperlink r:id="rId32" w:history="1">
         <w:r>
           <w:rPr>
             <w:rStyle w:val="Hyperlink"/>
@@ -2154,7 +2193,7 @@
       <w:r>
         <w:t xml:space="preserve">, </w:t>
       </w:r>
-      <w:hyperlink r:id="rId31" w:history="1">
+      <w:hyperlink r:id="rId33" w:history="1">
         <w:r>
           <w:rPr>
             <w:rStyle w:val="Hyperlink"/>
@@ -2180,13 +2219,8 @@
       <w:r>
         <w:t xml:space="preserve"> </w:t>
       </w:r>
-      <w:proofErr w:type="gramStart"/>
-      <w:r>
-        <w:t>Sadly</w:t>
-      </w:r>
-      <w:proofErr w:type="gramEnd"/>
-      <w:r>
-        <w:t xml:space="preserve"> it’s a separate file for each quarter :( but at least there’s time series data for metro LGAs 1991-2017.</w:t>
+      <w:r>
+        <w:t>Sadly it’s a separate file for each quarter :( but at least there’s time series data for metro LGAs 1991-2017.</w:t>
       </w:r>
     </w:p>
     <w:p>
@@ -2209,7 +2243,7 @@
       <w:r>
         <w:t xml:space="preserve"> Although </w:t>
       </w:r>
-      <w:hyperlink r:id="rId32" w:history="1">
+      <w:hyperlink r:id="rId34" w:history="1">
         <w:r>
           <w:rPr>
             <w:rStyle w:val="Hyperlink"/>
@@ -2238,7 +2272,7 @@
       <w:r>
         <w:t xml:space="preserve"> prices in certain LGAs and GCCSAs from 2017/18 (</w:t>
       </w:r>
-      <w:hyperlink r:id="rId33" w:history="1">
+      <w:hyperlink r:id="rId35" w:history="1">
         <w:r>
           <w:rPr>
             <w:rStyle w:val="Hyperlink"/>
@@ -2273,7 +2307,7 @@
       <w:r>
         <w:t>units up to SA4 (</w:t>
       </w:r>
-      <w:hyperlink r:id="rId34" w:history="1">
+      <w:hyperlink r:id="rId36" w:history="1">
         <w:r>
           <w:rPr>
             <w:rStyle w:val="Hyperlink"/>
@@ -2302,7 +2336,7 @@
       <w:r>
         <w:t xml:space="preserve">indicates that the median house is 3b and the median unit is 2b (see </w:t>
       </w:r>
-      <w:hyperlink r:id="rId35" w:history="1">
+      <w:hyperlink r:id="rId37" w:history="1">
         <w:r>
           <w:rPr>
             <w:rStyle w:val="Hyperlink"/>
@@ -2350,15 +2384,7 @@
         <w:t xml:space="preserve"> to 3b house and 2b unit rents!</w:t>
       </w:r>
       <w:r>
-        <w:t xml:space="preserve"> Maybe this is also the logic that </w:t>
-      </w:r>
-      <w:proofErr w:type="spellStart"/>
-      <w:r>
-        <w:t>Openstats</w:t>
-      </w:r>
-      <w:proofErr w:type="spellEnd"/>
-      <w:r>
-        <w:t xml:space="preserve"> uses to give 3b</w:t>
+        <w:t xml:space="preserve"> Maybe this is also the logic that Openstats uses to give 3b</w:t>
       </w:r>
       <w:r>
         <w:t xml:space="preserve"> house</w:t>
@@ -2406,7 +2432,7 @@
           <w:numId w:val="1"/>
         </w:numPr>
       </w:pPr>
-      <w:hyperlink r:id="rId36" w:history="1">
+      <w:hyperlink r:id="rId38" w:history="1">
         <w:r>
           <w:rPr>
             <w:rStyle w:val="Hyperlink"/>
@@ -2471,6 +2497,7 @@
     </w:p>
     <w:p>
       <w:r>
+        <w:lastRenderedPageBreak/>
         <w:t xml:space="preserve">Fox and Tulip 2014 </w:t>
       </w:r>
       <w:r>
@@ -2565,7 +2592,6 @@
         <w:jc w:val="left"/>
       </w:pPr>
       <w:r>
-        <w:lastRenderedPageBreak/>
         <w:t>Stapledon</w:t>
       </w:r>
       <w:r>
@@ -2617,7 +2643,7 @@
       <w:r>
         <w:t xml:space="preserve">RBA </w:t>
       </w:r>
-      <w:hyperlink r:id="rId37" w:history="1">
+      <w:hyperlink r:id="rId39" w:history="1">
         <w:r>
           <w:rPr>
             <w:rStyle w:val="Hyperlink"/>
@@ -2671,15 +2697,7 @@
         <w:t>Not</w:t>
       </w:r>
       <w:r>
-        <w:t xml:space="preserve"> including LMI would be </w:t>
-      </w:r>
-      <w:proofErr w:type="gramStart"/>
-      <w:r>
-        <w:t>ahistorical</w:t>
-      </w:r>
-      <w:proofErr w:type="gramEnd"/>
-      <w:r>
-        <w:t xml:space="preserve"> but it might be interesting to see what would happen if Howard had introduced the First Home Guarantee</w:t>
+        <w:t xml:space="preserve"> including LMI would be ahistorical but it might be interesting to see what would happen if Howard had introduced the First Home Guarantee</w:t>
       </w:r>
       <w:r>
         <w:t xml:space="preserve"> </w:t>
@@ -2728,7 +2746,7 @@
           <w:numId w:val="1"/>
         </w:numPr>
       </w:pPr>
-      <w:hyperlink r:id="rId38" w:history="1">
+      <w:hyperlink r:id="rId40" w:history="1">
         <w:r>
           <w:rPr>
             <w:rStyle w:val="Hyperlink"/>
@@ -2757,7 +2775,7 @@
           <w:numId w:val="1"/>
         </w:numPr>
       </w:pPr>
-      <w:hyperlink r:id="rId39" w:history="1">
+      <w:hyperlink r:id="rId41" w:history="1">
         <w:r>
           <w:rPr>
             <w:rStyle w:val="Hyperlink"/>
@@ -2768,7 +2786,7 @@
       <w:r>
         <w:t xml:space="preserve"> and </w:t>
       </w:r>
-      <w:hyperlink r:id="rId40" w:history="1">
+      <w:hyperlink r:id="rId42" w:history="1">
         <w:r>
           <w:rPr>
             <w:rStyle w:val="Hyperlink"/>
@@ -2851,12 +2869,19 @@
       <w:r>
         <w:t xml:space="preserve">through direct investment options or SMSFs. See the page on </w:t>
       </w:r>
-      <w:hyperlink r:id="rId41" w:history="1">
+      <w:hyperlink r:id="rId43" w:history="1">
         <w:r>
           <w:rPr>
             <w:rStyle w:val="Hyperlink"/>
           </w:rPr>
-          <w:t>Passive Investing Australia</w:t>
+          <w:t xml:space="preserve">Passive </w:t>
+        </w:r>
+        <w:r>
+          <w:rPr>
+            <w:rStyle w:val="Hyperlink"/>
+          </w:rPr>
+          <w:lastRenderedPageBreak/>
+          <w:t>Investing Australia</w:t>
         </w:r>
       </w:hyperlink>
       <w:r>
@@ -2882,7 +2907,7 @@
       <w:r>
         <w:t xml:space="preserve"> (or other data like </w:t>
       </w:r>
-      <w:hyperlink r:id="rId42" w:history="1">
+      <w:hyperlink r:id="rId44" w:history="1">
         <w:r>
           <w:rPr>
             <w:rStyle w:val="Hyperlink"/>
@@ -2906,130 +2931,121 @@
         <w:t>that’s difficult.</w:t>
       </w:r>
       <w:r>
+        <w:t xml:space="preserve"> Anyway they don’t have quarterly data like MSCI do.</w:t>
+      </w:r>
+    </w:p>
+    <w:p>
+      <w:pPr>
+        <w:pStyle w:val="Heading2"/>
+      </w:pPr>
+      <w:bookmarkStart w:id="11" w:name="_Toc230984671"/>
+      <w:r>
+        <w:t>Taxes – stamp duty</w:t>
+      </w:r>
+      <w:r>
+        <w:t xml:space="preserve"> (transfer duty)</w:t>
+      </w:r>
+      <w:bookmarkEnd w:id="11"/>
+    </w:p>
+    <w:p>
+      <w:r>
+        <w:t>We’re assuming stamp duty</w:t>
+      </w:r>
+      <w:r>
         <w:t xml:space="preserve"> </w:t>
       </w:r>
-      <w:proofErr w:type="gramStart"/>
-      <w:r>
-        <w:t>Anyway</w:t>
-      </w:r>
-      <w:proofErr w:type="gramEnd"/>
-      <w:r>
-        <w:t xml:space="preserve"> they don’t have quarterly data like MSCI do.</w:t>
-      </w:r>
-    </w:p>
-    <w:p>
-      <w:pPr>
-        <w:pStyle w:val="Heading2"/>
-      </w:pPr>
-      <w:bookmarkStart w:id="11" w:name="_Toc230984671"/>
-      <w:r>
-        <w:lastRenderedPageBreak/>
-        <w:t>Taxes – stamp duty</w:t>
-      </w:r>
-      <w:r>
-        <w:t xml:space="preserve"> (transfer duty)</w:t>
-      </w:r>
-      <w:bookmarkEnd w:id="11"/>
-    </w:p>
-    <w:p>
-      <w:r>
-        <w:t>We’re assuming stamp duty</w:t>
+      <w:r>
+        <w:t>(transfer duty)</w:t>
       </w:r>
       <w:r>
         <w:t xml:space="preserve"> </w:t>
       </w:r>
       <w:r>
-        <w:t>(transfer duty)</w:t>
+        <w:t xml:space="preserve">on buying the house </w:t>
+      </w:r>
+      <w:r>
+        <w:t>based on Jan 2006</w:t>
+      </w:r>
+      <w:r>
+        <w:t xml:space="preserve"> (~3</w:t>
+      </w:r>
+      <w:r>
+        <w:noBreakHyphen/>
+      </w:r>
+      <w:r>
+        <w:t>3.5%)</w:t>
+      </w:r>
+      <w:r>
+        <w:t xml:space="preserve"> calcs</w:t>
+      </w:r>
+      <w:r>
+        <w:t xml:space="preserve"> just to keep things simple for now. </w:t>
+      </w:r>
+      <w:r>
+        <w:t xml:space="preserve">Extension: Calculate stamp duty for multiple starting years in our model. Note: no need to calculate stamp duty </w:t>
+      </w:r>
+      <w:r>
+        <w:t>when selling</w:t>
+      </w:r>
+      <w:r>
+        <w:t xml:space="preserve">. As </w:t>
+      </w:r>
+      <w:r>
+        <w:t>the buyer pays stamp duty</w:t>
+      </w:r>
+      <w:r>
+        <w:t>, it is already priced in the home sale price.</w:t>
+      </w:r>
+    </w:p>
+    <w:p>
+      <w:pPr>
+        <w:pStyle w:val="Heading1"/>
+      </w:pPr>
+      <w:bookmarkStart w:id="12" w:name="_Toc230984672"/>
+      <w:r>
+        <w:t>Plan</w:t>
+      </w:r>
+      <w:bookmarkEnd w:id="12"/>
+    </w:p>
+    <w:p>
+      <w:r>
+        <w:t xml:space="preserve">It would be interesting to do rent-vs-buy </w:t>
+      </w:r>
+      <w:r>
+        <w:t>for both houses and units</w:t>
+      </w:r>
+      <w:r>
+        <w:t xml:space="preserve">, but that’s quite a bit of work. </w:t>
+      </w:r>
+      <w:r>
+        <w:t>I think d</w:t>
+      </w:r>
+      <w:r>
+        <w:t>oing the analysis for houses would be more interesting</w:t>
       </w:r>
       <w:r>
         <w:t xml:space="preserve"> </w:t>
       </w:r>
       <w:r>
-        <w:t xml:space="preserve">on buying the house </w:t>
-      </w:r>
-      <w:r>
-        <w:t>based on Jan 2006</w:t>
-      </w:r>
-      <w:r>
-        <w:t xml:space="preserve"> (~3</w:t>
-      </w:r>
-      <w:r>
-        <w:noBreakHyphen/>
-      </w:r>
-      <w:r>
-        <w:t>3.5%)</w:t>
-      </w:r>
-      <w:r>
-        <w:t xml:space="preserve"> calcs</w:t>
-      </w:r>
-      <w:r>
-        <w:t xml:space="preserve"> just to keep things simple for now. </w:t>
-      </w:r>
-      <w:r>
-        <w:t xml:space="preserve">Extension: Calculate stamp duty for multiple starting years in our model. Note: no need to calculate stamp duty </w:t>
-      </w:r>
-      <w:r>
-        <w:t>when selling</w:t>
-      </w:r>
-      <w:r>
-        <w:t xml:space="preserve">. As </w:t>
-      </w:r>
-      <w:r>
-        <w:t>the buyer pays stamp duty</w:t>
-      </w:r>
-      <w:r>
-        <w:t>, it is already priced in the home sale price.</w:t>
+        <w:t xml:space="preserve">because of the </w:t>
+      </w:r>
+      <w:r>
+        <w:t xml:space="preserve">“Australian dream” focus of having a detached house with a yard and a Hills Hoist etc., </w:t>
+      </w:r>
+      <w:r>
+        <w:t>and</w:t>
+      </w:r>
+      <w:r>
+        <w:t xml:space="preserve"> the popular conception of </w:t>
+      </w:r>
+      <w:r>
+        <w:t>houses being a better investment than apartments because they go up quicker in value.</w:t>
       </w:r>
     </w:p>
     <w:p>
       <w:pPr>
         <w:pStyle w:val="Heading1"/>
       </w:pPr>
-      <w:bookmarkStart w:id="12" w:name="_Toc230984672"/>
-      <w:r>
-        <w:t>Plan</w:t>
-      </w:r>
-      <w:bookmarkEnd w:id="12"/>
-    </w:p>
-    <w:p>
-      <w:r>
-        <w:t xml:space="preserve">It would be interesting to do rent-vs-buy </w:t>
-      </w:r>
-      <w:r>
-        <w:t>for both houses and units</w:t>
-      </w:r>
-      <w:r>
-        <w:t xml:space="preserve">, but that’s quite a bit of work. </w:t>
-      </w:r>
-      <w:r>
-        <w:t>I think d</w:t>
-      </w:r>
-      <w:r>
-        <w:t>oing the analysis for houses would be more interesting</w:t>
-      </w:r>
-      <w:r>
-        <w:t xml:space="preserve"> </w:t>
-      </w:r>
-      <w:r>
-        <w:t xml:space="preserve">because of the </w:t>
-      </w:r>
-      <w:r>
-        <w:t xml:space="preserve">“Australian dream” focus of having a detached house with a yard and a Hills Hoist etc., </w:t>
-      </w:r>
-      <w:r>
-        <w:t>and</w:t>
-      </w:r>
-      <w:r>
-        <w:t xml:space="preserve"> the popular conception of </w:t>
-      </w:r>
-      <w:r>
-        <w:t>houses being a better investment than apartments because they go up quicker in value.</w:t>
-      </w:r>
-    </w:p>
-    <w:p>
-      <w:pPr>
-        <w:pStyle w:val="Heading1"/>
-      </w:pPr>
       <w:bookmarkStart w:id="13" w:name="_Toc230984673"/>
       <w:r>
         <w:t>Superannuation</w:t>
@@ -3040,7 +3056,7 @@
       <w:r>
         <w:t xml:space="preserve">Prior to May 2006, there were </w:t>
       </w:r>
-      <w:hyperlink r:id="rId43" w:history="1">
+      <w:hyperlink r:id="rId45" w:history="1">
         <w:r>
           <w:rPr>
             <w:rStyle w:val="Hyperlink"/>
@@ -3051,7 +3067,7 @@
       <w:r>
         <w:t xml:space="preserve"> and there were “</w:t>
       </w:r>
-      <w:hyperlink r:id="rId44" w:anchor="ato-Reasonablebenefitlimits" w:history="1">
+      <w:hyperlink r:id="rId46" w:anchor="ato-Reasonablebenefitlimits" w:history="1">
         <w:r>
           <w:rPr>
             <w:rStyle w:val="Hyperlink"/>
@@ -3063,15 +3079,7 @@
         <w:t xml:space="preserve">” </w:t>
       </w:r>
       <w:r>
-        <w:t xml:space="preserve">that limited tax concessions for high </w:t>
-      </w:r>
-      <w:proofErr w:type="gramStart"/>
-      <w:r>
-        <w:t>lump-sum</w:t>
-      </w:r>
-      <w:proofErr w:type="gramEnd"/>
-      <w:r>
-        <w:t>/pension withdrawals from super.</w:t>
+        <w:t>that limited tax concessions for high lump-sum/pension withdrawals from super.</w:t>
       </w:r>
     </w:p>
     <w:sectPr>

</xml_diff>